<commit_message>
Inclui Costa (2004, 2023) e Poncioni (2007) no projeto PMGO
Co-Authored-By: Claude Opus 5.5 <noreply@anthropic.com>
Claude-Session: https://claude.ai/code/session_012kDm3eDcjoxunS5BBjgPmo
</commit_message>
<xml_diff>
--- a/entregas/projeto_compliance_pmgo.docx
+++ b/entregas/projeto_compliance_pmgo.docx
@@ -480,7 +480,7 @@
           <w:rFonts w:ascii="Times New Roman" w:hAnsi="Times New Roman" w:eastAsia="Times New Roman" w:cs="Times New Roman"/>
           <w:sz w:val="24"/>
         </w:rPr>
-        <w:t xml:space="preserve">No segundo eixo, Bayley (2001) situa a prestação de contas como condição do policiamento democrático. No Brasil, Lemgruber, Musumeci e Cano (2003) evidenciaram os limites de ouvidorias e corregedorias, e Pedrosa Júnior, Monteiro e Nascimento (2023) mostraram que o controle externo exercido pelo Ministério Público enfrenta obstáculos institucionais e corporativos. Esses estudos convergem para a constatação de que o controle reativo, embora necessário, é insuficiente. A teoria da justiça procedimental acrescenta que a legitimidade da polícia depende da forma como os policiais tratam os cidadãos (TYLER, 2006), o que desloca a atenção para as competências de conduta construídas na formação.</w:t>
+        <w:t xml:space="preserve">No segundo eixo, Bayley (2001) situa a prestação de contas como condição do policiamento democrático, e Costa (2004) sistematiza os mecanismos institucionais, internos e externos, pelos quais as democracias controlam suas polícias. No Brasil, Lemgruber, Musumeci e Cano (2003) evidenciaram os limites de ouvidorias e corregedorias, e Pedrosa Júnior, Monteiro e Nascimento (2023) mostraram que o controle externo exercido pelo Ministério Público enfrenta obstáculos institucionais e corporativos. Esses estudos convergem para a constatação de que o controle reativo, embora necessário, é insuficiente. A teoria da justiça procedimental acrescenta que a legitimidade da polícia depende da forma como os policiais tratam os cidadãos (TYLER, 2006), o que desloca a atenção para as competências de conduta construídas na formação.</w:t>
       </w:r>
     </w:p>
     <w:p>
@@ -594,7 +594,7 @@
           <w:rFonts w:ascii="Times New Roman" w:hAnsi="Times New Roman" w:eastAsia="Times New Roman" w:cs="Times New Roman"/>
           <w:sz w:val="24"/>
         </w:rPr>
-        <w:t xml:space="preserve">(BRASIL, 2014). A questão, contudo, não é apenas a presença desses conteúdos no currículo, mas a sua capacidade de alterar condutas. Silva (2021), ao analisar o currículo de formação da Polícia Militar da Bahia, identificou ausências relevantes em temas sensíveis à atuação policial, o que indica a distância entre as diretrizes nacionais e a formação de fato ministrada. É a partir daí que se indaga em que medida a educação policial opera como pilar do compliance na prevenção de desvios de conduta.</w:t>
+        <w:t xml:space="preserve">(BRASIL, 2014), atualizada em 2014 e dividida em oito áreas temáticas (COSTA, 2023). Poncioni (2007), no entanto, aponta que a mudança na formação policial esbarra na precariedade das academias de polícia, na ausência de instrutores dedicados exclusivamente ao ensino e na escassez de manuais de doutrina. Costa (2023) acrescenta que, para limitar a discricionariedade e os abusos, as polícias recorreram a duas estratégias complementares, a melhoria da formação e a criação de normas de conduta, e adverte que não basta mudar os conteúdos ministrados, sendo necessário mudar também a própria metodologia de ensino. A questão, portanto, não é apenas a presença desses conteúdos no currículo, mas a sua capacidade de alterar condutas. Silva (2021), ao analisar o currículo de formação da Polícia Militar da Bahia, identificou ausências relevantes em temas sensíveis à atuação policial, o que indica a distância entre as diretrizes nacionais e a formação de fato ministrada. É a partir daí que se indaga em que medida a educação policial opera como pilar do compliance na prevenção de desvios de conduta.</w:t>
       </w:r>
     </w:p>
     <w:bookmarkEnd w:id="23"/>
@@ -2549,7 +2549,7 @@
           <w:rFonts w:ascii="Times New Roman" w:hAnsi="Times New Roman" w:eastAsia="Times New Roman" w:cs="Times New Roman"/>
           <w:sz w:val="24"/>
         </w:rPr>
-        <w:t xml:space="preserve">LEMGRUBER, J.; MUSUMECI, L.; CANO, I.</w:t>
+        <w:t xml:space="preserve">COSTA, A. T. M. Como as democracias controlam as polícias: os mecanismos institucionais de controle da atividade policial.</w:t>
       </w:r>
       <w:r>
         <w:rPr>
@@ -2565,21 +2565,14 @@
           <w:b/>
           <w:sz w:val="24"/>
         </w:rPr>
-        <w:t xml:space="preserve">Quem vigia os vigias?</w:t>
-      </w:r>
-      <w:r>
-        <w:rPr>
-          <w:rFonts w:ascii="Times New Roman" w:hAnsi="Times New Roman" w:eastAsia="Times New Roman" w:cs="Times New Roman"/>
-          <w:sz w:val="24"/>
-        </w:rPr>
-        <w:t xml:space="preserve"> </w:t>
-      </w:r>
-      <w:r>
-        <w:rPr>
-          <w:rFonts w:ascii="Times New Roman" w:hAnsi="Times New Roman" w:eastAsia="Times New Roman" w:cs="Times New Roman"/>
-          <w:sz w:val="24"/>
-        </w:rPr>
-        <w:t xml:space="preserve">Um estudo sobre controle externo da polícia no Brasil. Rio de Janeiro: Record, 2003.</w:t>
+        <w:t xml:space="preserve">Novos Estudos CEBRAP</w:t>
+      </w:r>
+      <w:r>
+        <w:rPr>
+          <w:rFonts w:ascii="Times New Roman" w:hAnsi="Times New Roman" w:eastAsia="Times New Roman" w:cs="Times New Roman"/>
+          <w:sz w:val="24"/>
+        </w:rPr>
+        <w:t xml:space="preserve">, São Paulo, n. 70, p. 65-78, 2004.</w:t>
       </w:r>
     </w:p>
     <w:p>
@@ -2593,7 +2586,7 @@
           <w:rFonts w:ascii="Times New Roman" w:hAnsi="Times New Roman" w:eastAsia="Times New Roman" w:cs="Times New Roman"/>
           <w:sz w:val="24"/>
         </w:rPr>
-        <w:t xml:space="preserve">MENDES, F. S.; CARVALHO, V. M.</w:t>
+        <w:t xml:space="preserve">COSTA, A. T. M.</w:t>
       </w:r>
       <w:r>
         <w:rPr>
@@ -2609,14 +2602,14 @@
           <w:b/>
           <w:sz w:val="24"/>
         </w:rPr>
-        <w:t xml:space="preserve">Compliance</w:t>
-      </w:r>
-      <w:r>
-        <w:rPr>
-          <w:rFonts w:ascii="Times New Roman" w:hAnsi="Times New Roman" w:eastAsia="Times New Roman" w:cs="Times New Roman"/>
-          <w:sz w:val="24"/>
-        </w:rPr>
-        <w:t xml:space="preserve">: concorrência e combate à corrupção. São Paulo: Trevisan Editora, 2017.</w:t>
+        <w:t xml:space="preserve">Segurança pública, redes e governança</w:t>
+      </w:r>
+      <w:r>
+        <w:rPr>
+          <w:rFonts w:ascii="Times New Roman" w:hAnsi="Times New Roman" w:eastAsia="Times New Roman" w:cs="Times New Roman"/>
+          <w:sz w:val="24"/>
+        </w:rPr>
+        <w:t xml:space="preserve">. Brasília: Editora UnB, 2023. DOI: 10.7476/9786558461708.</w:t>
       </w:r>
     </w:p>
     <w:p>
@@ -2630,7 +2623,7 @@
           <w:rFonts w:ascii="Times New Roman" w:hAnsi="Times New Roman" w:eastAsia="Times New Roman" w:cs="Times New Roman"/>
           <w:sz w:val="24"/>
         </w:rPr>
-        <w:t xml:space="preserve">MOTA, M. Q.</w:t>
+        <w:t xml:space="preserve">LEMGRUBER, J.; MUSUMECI, L.; CANO, I.</w:t>
       </w:r>
       <w:r>
         <w:rPr>
@@ -2646,14 +2639,21 @@
           <w:b/>
           <w:sz w:val="24"/>
         </w:rPr>
-        <w:t xml:space="preserve">O compliance como instrumento de políticas públicas de integridade e de combate à corrupção na administração direta</w:t>
-      </w:r>
-      <w:r>
-        <w:rPr>
-          <w:rFonts w:ascii="Times New Roman" w:hAnsi="Times New Roman" w:eastAsia="Times New Roman" w:cs="Times New Roman"/>
-          <w:sz w:val="24"/>
-        </w:rPr>
-        <w:t xml:space="preserve">. 2020. Dissertação (Mestrado em Direito, Governança e Políticas Públicas) – Universidade Salvador, Salvador, 2020.</w:t>
+        <w:t xml:space="preserve">Quem vigia os vigias?</w:t>
+      </w:r>
+      <w:r>
+        <w:rPr>
+          <w:rFonts w:ascii="Times New Roman" w:hAnsi="Times New Roman" w:eastAsia="Times New Roman" w:cs="Times New Roman"/>
+          <w:sz w:val="24"/>
+        </w:rPr>
+        <w:t xml:space="preserve"> </w:t>
+      </w:r>
+      <w:r>
+        <w:rPr>
+          <w:rFonts w:ascii="Times New Roman" w:hAnsi="Times New Roman" w:eastAsia="Times New Roman" w:cs="Times New Roman"/>
+          <w:sz w:val="24"/>
+        </w:rPr>
+        <w:t xml:space="preserve">Um estudo sobre controle externo da polícia no Brasil. Rio de Janeiro: Record, 2003.</w:t>
       </w:r>
     </w:p>
     <w:p>
@@ -2667,7 +2667,7 @@
           <w:rFonts w:ascii="Times New Roman" w:hAnsi="Times New Roman" w:eastAsia="Times New Roman" w:cs="Times New Roman"/>
           <w:sz w:val="24"/>
         </w:rPr>
-        <w:t xml:space="preserve">OCDE.</w:t>
+        <w:t xml:space="preserve">MENDES, F. S.; CARVALHO, V. M.</w:t>
       </w:r>
       <w:r>
         <w:rPr>
@@ -2683,14 +2683,14 @@
           <w:b/>
           <w:sz w:val="24"/>
         </w:rPr>
-        <w:t xml:space="preserve">Recomendação do Conselho da OCDE sobre integridade pública</w:t>
-      </w:r>
-      <w:r>
-        <w:rPr>
-          <w:rFonts w:ascii="Times New Roman" w:hAnsi="Times New Roman" w:eastAsia="Times New Roman" w:cs="Times New Roman"/>
-          <w:sz w:val="24"/>
-        </w:rPr>
-        <w:t xml:space="preserve">. Paris: OCDE, 2017.</w:t>
+        <w:t xml:space="preserve">Compliance</w:t>
+      </w:r>
+      <w:r>
+        <w:rPr>
+          <w:rFonts w:ascii="Times New Roman" w:hAnsi="Times New Roman" w:eastAsia="Times New Roman" w:cs="Times New Roman"/>
+          <w:sz w:val="24"/>
+        </w:rPr>
+        <w:t xml:space="preserve">: concorrência e combate à corrupção. São Paulo: Trevisan Editora, 2017.</w:t>
       </w:r>
     </w:p>
     <w:p>
@@ -2704,7 +2704,7 @@
           <w:rFonts w:ascii="Times New Roman" w:hAnsi="Times New Roman" w:eastAsia="Times New Roman" w:cs="Times New Roman"/>
           <w:sz w:val="24"/>
         </w:rPr>
-        <w:t xml:space="preserve">OLIVEIRA, A. Os policiais podem ser controlados?</w:t>
+        <w:t xml:space="preserve">MOTA, M. Q.</w:t>
       </w:r>
       <w:r>
         <w:rPr>
@@ -2720,14 +2720,14 @@
           <w:b/>
           <w:sz w:val="24"/>
         </w:rPr>
-        <w:t xml:space="preserve">Sociologias</w:t>
-      </w:r>
-      <w:r>
-        <w:rPr>
-          <w:rFonts w:ascii="Times New Roman" w:hAnsi="Times New Roman" w:eastAsia="Times New Roman" w:cs="Times New Roman"/>
-          <w:sz w:val="24"/>
-        </w:rPr>
-        <w:t xml:space="preserve">, Porto Alegre, v. 12, n. 23, p. 142-174, 2010.</w:t>
+        <w:t xml:space="preserve">O compliance como instrumento de políticas públicas de integridade e de combate à corrupção na administração direta</w:t>
+      </w:r>
+      <w:r>
+        <w:rPr>
+          <w:rFonts w:ascii="Times New Roman" w:hAnsi="Times New Roman" w:eastAsia="Times New Roman" w:cs="Times New Roman"/>
+          <w:sz w:val="24"/>
+        </w:rPr>
+        <w:t xml:space="preserve">. 2020. Dissertação (Mestrado em Direito, Governança e Políticas Públicas) – Universidade Salvador, Salvador, 2020.</w:t>
       </w:r>
     </w:p>
     <w:p>
@@ -2741,7 +2741,7 @@
           <w:rFonts w:ascii="Times New Roman" w:hAnsi="Times New Roman" w:eastAsia="Times New Roman" w:cs="Times New Roman"/>
           <w:sz w:val="24"/>
         </w:rPr>
-        <w:t xml:space="preserve">PEDROSA JÚNIOR, J. L. C.; MONTEIRO, L. M.; NASCIMENTO, E. O. Accountability e controle externo da atividade policial: uma análise das diretrizes do CNMP no enfrentamento à letalidade policial.</w:t>
+        <w:t xml:space="preserve">OCDE.</w:t>
       </w:r>
       <w:r>
         <w:rPr>
@@ -2757,14 +2757,14 @@
           <w:b/>
           <w:sz w:val="24"/>
         </w:rPr>
-        <w:t xml:space="preserve">REDES: Revista Eletrônica Direito e Sociedade</w:t>
-      </w:r>
-      <w:r>
-        <w:rPr>
-          <w:rFonts w:ascii="Times New Roman" w:hAnsi="Times New Roman" w:eastAsia="Times New Roman" w:cs="Times New Roman"/>
-          <w:sz w:val="24"/>
-        </w:rPr>
-        <w:t xml:space="preserve">, Canoas, v. 11, n. 2, 2023. DOI: 10.18316/REDES.v11i2.9556.</w:t>
+        <w:t xml:space="preserve">Recomendação do Conselho da OCDE sobre integridade pública</w:t>
+      </w:r>
+      <w:r>
+        <w:rPr>
+          <w:rFonts w:ascii="Times New Roman" w:hAnsi="Times New Roman" w:eastAsia="Times New Roman" w:cs="Times New Roman"/>
+          <w:sz w:val="24"/>
+        </w:rPr>
+        <w:t xml:space="preserve">. Paris: OCDE, 2017.</w:t>
       </w:r>
     </w:p>
     <w:p>
@@ -2778,6 +2778,80 @@
           <w:rFonts w:ascii="Times New Roman" w:hAnsi="Times New Roman" w:eastAsia="Times New Roman" w:cs="Times New Roman"/>
           <w:sz w:val="24"/>
         </w:rPr>
+        <w:t xml:space="preserve">OLIVEIRA, A. Os policiais podem ser controlados?</w:t>
+      </w:r>
+      <w:r>
+        <w:rPr>
+          <w:rFonts w:ascii="Times New Roman" w:hAnsi="Times New Roman" w:eastAsia="Times New Roman" w:cs="Times New Roman"/>
+          <w:sz w:val="24"/>
+        </w:rPr>
+        <w:t xml:space="preserve"> </w:t>
+      </w:r>
+      <w:r>
+        <w:rPr>
+          <w:bCs/>
+          <w:rFonts w:ascii="Times New Roman" w:hAnsi="Times New Roman" w:eastAsia="Times New Roman" w:cs="Times New Roman"/>
+          <w:b/>
+          <w:sz w:val="24"/>
+        </w:rPr>
+        <w:t xml:space="preserve">Sociologias</w:t>
+      </w:r>
+      <w:r>
+        <w:rPr>
+          <w:rFonts w:ascii="Times New Roman" w:hAnsi="Times New Roman" w:eastAsia="Times New Roman" w:cs="Times New Roman"/>
+          <w:sz w:val="24"/>
+        </w:rPr>
+        <w:t xml:space="preserve">, Porto Alegre, v. 12, n. 23, p. 142-174, 2010.</w:t>
+      </w:r>
+    </w:p>
+    <w:p>
+      <w:pPr>
+        <w:pStyle w:val="BodyText"/>
+        <w:spacing w:line="240" w:lineRule="auto" w:before="0" w:after="240"/>
+        <w:jc w:val="left"/>
+      </w:pPr>
+      <w:r>
+        <w:rPr>
+          <w:rFonts w:ascii="Times New Roman" w:hAnsi="Times New Roman" w:eastAsia="Times New Roman" w:cs="Times New Roman"/>
+          <w:sz w:val="24"/>
+        </w:rPr>
+        <w:t xml:space="preserve">PEDROSA JÚNIOR, J. L. C.; MONTEIRO, L. M.; NASCIMENTO, E. O. Accountability e controle externo da atividade policial: uma análise das diretrizes do CNMP no enfrentamento à letalidade policial.</w:t>
+      </w:r>
+      <w:r>
+        <w:rPr>
+          <w:rFonts w:ascii="Times New Roman" w:hAnsi="Times New Roman" w:eastAsia="Times New Roman" w:cs="Times New Roman"/>
+          <w:sz w:val="24"/>
+        </w:rPr>
+        <w:t xml:space="preserve"> </w:t>
+      </w:r>
+      <w:r>
+        <w:rPr>
+          <w:bCs/>
+          <w:rFonts w:ascii="Times New Roman" w:hAnsi="Times New Roman" w:eastAsia="Times New Roman" w:cs="Times New Roman"/>
+          <w:b/>
+          <w:sz w:val="24"/>
+        </w:rPr>
+        <w:t xml:space="preserve">REDES: Revista Eletrônica Direito e Sociedade</w:t>
+      </w:r>
+      <w:r>
+        <w:rPr>
+          <w:rFonts w:ascii="Times New Roman" w:hAnsi="Times New Roman" w:eastAsia="Times New Roman" w:cs="Times New Roman"/>
+          <w:sz w:val="24"/>
+        </w:rPr>
+        <w:t xml:space="preserve">, Canoas, v. 11, n. 2, 2023. DOI: 10.18316/REDES.v11i2.9556.</w:t>
+      </w:r>
+    </w:p>
+    <w:p>
+      <w:pPr>
+        <w:pStyle w:val="BodyText"/>
+        <w:spacing w:line="240" w:lineRule="auto" w:before="0" w:after="240"/>
+        <w:jc w:val="left"/>
+      </w:pPr>
+      <w:r>
+        <w:rPr>
+          <w:rFonts w:ascii="Times New Roman" w:hAnsi="Times New Roman" w:eastAsia="Times New Roman" w:cs="Times New Roman"/>
+          <w:sz w:val="24"/>
+        </w:rPr>
         <w:t xml:space="preserve">PINHEIRO, A. S. A polícia corrupta e violenta: os dilemas civilizatórios nas práticas policiais.</w:t>
       </w:r>
       <w:r>
@@ -2802,6 +2876,43 @@
           <w:sz w:val="24"/>
         </w:rPr>
         <w:t xml:space="preserve">, Brasília, v. 28, n. 2, maio/ago. 2013.</w:t>
+      </w:r>
+    </w:p>
+    <w:p>
+      <w:pPr>
+        <w:pStyle w:val="BodyText"/>
+        <w:spacing w:line="240" w:lineRule="auto" w:before="0" w:after="240"/>
+        <w:jc w:val="left"/>
+      </w:pPr>
+      <w:r>
+        <w:rPr>
+          <w:rFonts w:ascii="Times New Roman" w:hAnsi="Times New Roman" w:eastAsia="Times New Roman" w:cs="Times New Roman"/>
+          <w:sz w:val="24"/>
+        </w:rPr>
+        <w:t xml:space="preserve">PONCIONI, P. Tendências e desafios na formação profissional do policial no Brasil.</w:t>
+      </w:r>
+      <w:r>
+        <w:rPr>
+          <w:rFonts w:ascii="Times New Roman" w:hAnsi="Times New Roman" w:eastAsia="Times New Roman" w:cs="Times New Roman"/>
+          <w:sz w:val="24"/>
+        </w:rPr>
+        <w:t xml:space="preserve"> </w:t>
+      </w:r>
+      <w:r>
+        <w:rPr>
+          <w:bCs/>
+          <w:rFonts w:ascii="Times New Roman" w:hAnsi="Times New Roman" w:eastAsia="Times New Roman" w:cs="Times New Roman"/>
+          <w:b/>
+          <w:sz w:val="24"/>
+        </w:rPr>
+        <w:t xml:space="preserve">Revista Brasileira de Segurança Pública</w:t>
+      </w:r>
+      <w:r>
+        <w:rPr>
+          <w:rFonts w:ascii="Times New Roman" w:hAnsi="Times New Roman" w:eastAsia="Times New Roman" w:cs="Times New Roman"/>
+          <w:sz w:val="24"/>
+        </w:rPr>
+        <w:t xml:space="preserve">, São Paulo, v. 1, n. 1, p. 22-31, 2007.</w:t>
       </w:r>
     </w:p>
     <w:p>

</xml_diff>